<commit_message>
📝 Update Word documentation with dashboard screenshots
</commit_message>
<xml_diff>
--- a/docs/Sales_Forecast_Pro_Documentation.docx
+++ b/docs/Sales_Forecast_Pro_Documentation.docx
@@ -16,7 +16,228 @@
         <w:pStyle w:val="Heading1"/>
       </w:pPr>
       <w:r>
-        <w:t>Table of Contents</w:t>
+        <w:t>Executive Dashboard Summary</w:t>
+      </w:r>
+    </w:p>
+    <w:p>
+      <w:r>
+        <w:drawing>
+          <wp:inline xmlns:a="http://schemas.openxmlformats.org/drawingml/2006/main" xmlns:pic="http://schemas.openxmlformats.org/drawingml/2006/picture">
+            <wp:extent cx="5486400" cy="2508885"/>
+            <wp:docPr id="1" name="Picture 1"/>
+            <wp:cNvGraphicFramePr>
+              <a:graphicFrameLocks noChangeAspect="1"/>
+            </wp:cNvGraphicFramePr>
+            <a:graphic>
+              <a:graphicData uri="http://schemas.openxmlformats.org/drawingml/2006/picture">
+                <pic:pic>
+                  <pic:nvPicPr>
+                    <pic:cNvPr id="0" name="overview.png"/>
+                    <pic:cNvPicPr/>
+                  </pic:nvPicPr>
+                  <pic:blipFill>
+                    <a:blip r:embed="rId9"/>
+                    <a:stretch>
+                      <a:fillRect/>
+                    </a:stretch>
+                  </pic:blipFill>
+                  <pic:spPr>
+                    <a:xfrm>
+                      <a:off x="0" y="0"/>
+                      <a:ext cx="5486400" cy="2508885"/>
+                    </a:xfrm>
+                    <a:prstGeom prst="rect"/>
+                  </pic:spPr>
+                </pic:pic>
+              </a:graphicData>
+            </a:graphic>
+          </wp:inline>
+        </w:drawing>
+      </w:r>
+    </w:p>
+    <w:p>
+      <w:pPr>
+        <w:jc w:val="center"/>
+      </w:pPr>
+      <w:r>
+        <w:t>Dashboard View: Overview</w:t>
+      </w:r>
+    </w:p>
+    <w:p/>
+    <w:p>
+      <w:r>
+        <w:drawing>
+          <wp:inline xmlns:a="http://schemas.openxmlformats.org/drawingml/2006/main" xmlns:pic="http://schemas.openxmlformats.org/drawingml/2006/picture">
+            <wp:extent cx="5486400" cy="2508885"/>
+            <wp:docPr id="2" name="Picture 2"/>
+            <wp:cNvGraphicFramePr>
+              <a:graphicFrameLocks noChangeAspect="1"/>
+            </wp:cNvGraphicFramePr>
+            <a:graphic>
+              <a:graphicData uri="http://schemas.openxmlformats.org/drawingml/2006/picture">
+                <pic:pic>
+                  <pic:nvPicPr>
+                    <pic:cNvPr id="0" name="forecast.png"/>
+                    <pic:cNvPicPr/>
+                  </pic:nvPicPr>
+                  <pic:blipFill>
+                    <a:blip r:embed="rId10"/>
+                    <a:stretch>
+                      <a:fillRect/>
+                    </a:stretch>
+                  </pic:blipFill>
+                  <pic:spPr>
+                    <a:xfrm>
+                      <a:off x="0" y="0"/>
+                      <a:ext cx="5486400" cy="2508885"/>
+                    </a:xfrm>
+                    <a:prstGeom prst="rect"/>
+                  </pic:spPr>
+                </pic:pic>
+              </a:graphicData>
+            </a:graphic>
+          </wp:inline>
+        </w:drawing>
+      </w:r>
+    </w:p>
+    <w:p>
+      <w:pPr>
+        <w:jc w:val="center"/>
+      </w:pPr>
+      <w:r>
+        <w:t>Dashboard View: Forecast</w:t>
+      </w:r>
+    </w:p>
+    <w:p/>
+    <w:p>
+      <w:r>
+        <w:drawing>
+          <wp:inline xmlns:a="http://schemas.openxmlformats.org/drawingml/2006/main" xmlns:pic="http://schemas.openxmlformats.org/drawingml/2006/picture">
+            <wp:extent cx="5486400" cy="2508885"/>
+            <wp:docPr id="3" name="Picture 3"/>
+            <wp:cNvGraphicFramePr>
+              <a:graphicFrameLocks noChangeAspect="1"/>
+            </wp:cNvGraphicFramePr>
+            <a:graphic>
+              <a:graphicData uri="http://schemas.openxmlformats.org/drawingml/2006/picture">
+                <pic:pic>
+                  <pic:nvPicPr>
+                    <pic:cNvPr id="0" name="models.png"/>
+                    <pic:cNvPicPr/>
+                  </pic:nvPicPr>
+                  <pic:blipFill>
+                    <a:blip r:embed="rId11"/>
+                    <a:stretch>
+                      <a:fillRect/>
+                    </a:stretch>
+                  </pic:blipFill>
+                  <pic:spPr>
+                    <a:xfrm>
+                      <a:off x="0" y="0"/>
+                      <a:ext cx="5486400" cy="2508885"/>
+                    </a:xfrm>
+                    <a:prstGeom prst="rect"/>
+                  </pic:spPr>
+                </pic:pic>
+              </a:graphicData>
+            </a:graphic>
+          </wp:inline>
+        </w:drawing>
+      </w:r>
+    </w:p>
+    <w:p>
+      <w:pPr>
+        <w:jc w:val="center"/>
+      </w:pPr>
+      <w:r>
+        <w:t>Dashboard View: Models</w:t>
+      </w:r>
+    </w:p>
+    <w:p/>
+    <w:p>
+      <w:r>
+        <w:drawing>
+          <wp:inline xmlns:a="http://schemas.openxmlformats.org/drawingml/2006/main" xmlns:pic="http://schemas.openxmlformats.org/drawingml/2006/picture">
+            <wp:extent cx="5486400" cy="2508885"/>
+            <wp:docPr id="4" name="Picture 4"/>
+            <wp:cNvGraphicFramePr>
+              <a:graphicFrameLocks noChangeAspect="1"/>
+            </wp:cNvGraphicFramePr>
+            <a:graphic>
+              <a:graphicData uri="http://schemas.openxmlformats.org/drawingml/2006/picture">
+                <pic:pic>
+                  <pic:nvPicPr>
+                    <pic:cNvPr id="0" name="national.png"/>
+                    <pic:cNvPicPr/>
+                  </pic:nvPicPr>
+                  <pic:blipFill>
+                    <a:blip r:embed="rId12"/>
+                    <a:stretch>
+                      <a:fillRect/>
+                    </a:stretch>
+                  </pic:blipFill>
+                  <pic:spPr>
+                    <a:xfrm>
+                      <a:off x="0" y="0"/>
+                      <a:ext cx="5486400" cy="2508885"/>
+                    </a:xfrm>
+                    <a:prstGeom prst="rect"/>
+                  </pic:spPr>
+                </pic:pic>
+              </a:graphicData>
+            </a:graphic>
+          </wp:inline>
+        </w:drawing>
+      </w:r>
+    </w:p>
+    <w:p>
+      <w:pPr>
+        <w:jc w:val="center"/>
+      </w:pPr>
+      <w:r>
+        <w:t>Dashboard View: National</w:t>
+      </w:r>
+    </w:p>
+    <w:p/>
+    <w:p>
+      <w:r>
+        <w:br w:type="page"/>
+      </w:r>
+    </w:p>
+    <w:p>
+      <w:pPr>
+        <w:pStyle w:val="Heading1"/>
+      </w:pPr>
+      <w:r>
+        <w:t>Sales Forecast Pro — Project Documentation</w:t>
+      </w:r>
+    </w:p>
+    <w:p>
+      <w:r>
+        <w:t>This document provides a developer-friendly overview of the project, setup instructions, API examples, and sample outputs to help you run, develop, and debug the system.</w:t>
+      </w:r>
+    </w:p>
+    <w:p>
+      <w:r>
+        <w:t>---</w:t>
+      </w:r>
+    </w:p>
+    <w:p>
+      <w:pPr>
+        <w:pStyle w:val="Heading2"/>
+      </w:pPr>
+      <w:r>
+        <w:t>1. Overview</w:t>
+      </w:r>
+    </w:p>
+    <w:p>
+      <w:r>
+        <w:t>Sales Forecast Pro is a production-ready weekly per-state sales forecasting pipeline. It trains multiple model families (ARIMA, SARIMA, Prophet, XGBoost, LSTM), evaluates them using walk-forward CV, selects a top-K ensemble per state, and serves forecasts via a FastAPI backend and a Streamlit dashboard.</w:t>
+      </w:r>
+    </w:p>
+    <w:p>
+      <w:r>
+        <w:t>Key locations:</w:t>
       </w:r>
     </w:p>
     <w:p>
@@ -24,7 +245,7 @@
         <w:pStyle w:val="ListBullet"/>
       </w:pPr>
       <w:r>
-        <w:t>01 Overview</w:t>
+        <w:t>Source: `src/sales_forecast`</w:t>
       </w:r>
     </w:p>
     <w:p>
@@ -32,7 +253,7 @@
         <w:pStyle w:val="ListBullet"/>
       </w:pPr>
       <w:r>
-        <w:t>02 Getting Started</w:t>
+        <w:t>Config: `config.yaml`</w:t>
       </w:r>
     </w:p>
     <w:p>
@@ -40,7 +261,7 @@
         <w:pStyle w:val="ListBullet"/>
       </w:pPr>
       <w:r>
-        <w:t>03 Configuration</w:t>
+        <w:t>Packaging: `pyproject.toml`</w:t>
       </w:r>
     </w:p>
     <w:p>
@@ -48,7 +269,106 @@
         <w:pStyle w:val="ListBullet"/>
       </w:pPr>
       <w:r>
-        <w:t>04 Data Pipeline</w:t>
+        <w:t>Artifacts / registry: `artifacts/registry`</w:t>
+      </w:r>
+    </w:p>
+    <w:p>
+      <w:r>
+        <w:t>---</w:t>
+      </w:r>
+    </w:p>
+    <w:p>
+      <w:pPr>
+        <w:pStyle w:val="Heading2"/>
+      </w:pPr>
+      <w:r>
+        <w:t>2. Quick Start</w:t>
+      </w:r>
+    </w:p>
+    <w:p>
+      <w:r>
+        <w:t>1. Install (recommended inside a virtualenv):</w:t>
+      </w:r>
+    </w:p>
+    <w:p>
+      <w:pPr/>
+      <w:r>
+        <w:rPr>
+          <w:rFonts w:ascii="Courier New" w:hAnsi="Courier New"/>
+          <w:sz w:val="18"/>
+        </w:rPr>
+        <w:t>git clone https://github.com/praveen0006/MicroG.git</w:t>
+        <w:br/>
+        <w:t>cd MicroG</w:t>
+        <w:br/>
+        <w:t>pip install -e .</w:t>
+      </w:r>
+    </w:p>
+    <w:p>
+      <w:r>
+        <w:t>2. Train (example: California):</w:t>
+      </w:r>
+    </w:p>
+    <w:p>
+      <w:pPr/>
+      <w:r>
+        <w:rPr>
+          <w:rFonts w:ascii="Courier New" w:hAnsi="Courier New"/>
+          <w:sz w:val="18"/>
+        </w:rPr>
+        <w:t># Using the provided console script (installed by pip install -e .)</w:t>
+        <w:br/>
+        <w:t>sales-forecast-train --states California</w:t>
+        <w:br/>
+        <w:br/>
+        <w:t># or via module entrypoint</w:t>
+        <w:br/>
+        <w:t>python -m sales_forecast.training.cli --states California</w:t>
+      </w:r>
+    </w:p>
+    <w:p>
+      <w:r>
+        <w:t>3. Start the API and dashboard:</w:t>
+      </w:r>
+    </w:p>
+    <w:p>
+      <w:pPr/>
+      <w:r>
+        <w:rPr>
+          <w:rFonts w:ascii="Courier New" w:hAnsi="Courier New"/>
+          <w:sz w:val="18"/>
+        </w:rPr>
+        <w:t># Start API (uvicorn/entrypoint)</w:t>
+        <w:br/>
+        <w:t>sales-forecast-api --port 8000</w:t>
+        <w:br/>
+        <w:br/>
+        <w:t># Start Streamlit dashboard</w:t>
+        <w:br/>
+        <w:t>streamlit run dashboard/streamlit_app.py</w:t>
+      </w:r>
+    </w:p>
+    <w:p>
+      <w:r>
+        <w:t>Notes: Training writes a versioned registry under the configured artifacts directory. The API loads the current registry by reading the manifest.json in the registry root.</w:t>
+      </w:r>
+    </w:p>
+    <w:p>
+      <w:r>
+        <w:t>---</w:t>
+      </w:r>
+    </w:p>
+    <w:p>
+      <w:pPr>
+        <w:pStyle w:val="Heading2"/>
+      </w:pPr>
+      <w:r>
+        <w:t>3. API Reference &amp; Examples</w:t>
+      </w:r>
+    </w:p>
+    <w:p>
+      <w:r>
+        <w:t>The FastAPI app is defined in src/salesforecast/api/app.py and exposes these important endpoints:</w:t>
       </w:r>
     </w:p>
     <w:p>
@@ -56,7 +376,7 @@
         <w:pStyle w:val="ListBullet"/>
       </w:pPr>
       <w:r>
-        <w:t>05 Feature Engineering</w:t>
+        <w:t>`GET /health` — service health and loaded registry version.</w:t>
       </w:r>
     </w:p>
     <w:p>
@@ -64,7 +384,7 @@
         <w:pStyle w:val="ListBullet"/>
       </w:pPr>
       <w:r>
-        <w:t>06 Models</w:t>
+        <w:t>`POST /train` — trigger a background training job.</w:t>
       </w:r>
     </w:p>
     <w:p>
@@ -72,7 +392,7 @@
         <w:pStyle w:val="ListBullet"/>
       </w:pPr>
       <w:r>
-        <w:t>07 Training Pipeline</w:t>
+        <w:t>`GET /train/{job_id}` — query training status.</w:t>
       </w:r>
     </w:p>
     <w:p>
@@ -80,7 +400,7 @@
         <w:pStyle w:val="ListBullet"/>
       </w:pPr>
       <w:r>
-        <w:t>08 Ensembling and Conformal</w:t>
+        <w:t>`GET /predict` — get forecast for a state (requires trained registry).</w:t>
       </w:r>
     </w:p>
     <w:p>
@@ -88,7 +408,7 @@
         <w:pStyle w:val="ListBullet"/>
       </w:pPr>
       <w:r>
-        <w:t>09 API and Service</w:t>
+        <w:t>`GET /predict/breakdown` — ensemble + per-member forecasts.</w:t>
       </w:r>
     </w:p>
     <w:p>
@@ -96,7 +416,7 @@
         <w:pStyle w:val="ListBullet"/>
       </w:pPr>
       <w:r>
-        <w:t>10 Dashboard</w:t>
+        <w:t>`GET /backtest` — saved CV predictions and metrics.</w:t>
       </w:r>
     </w:p>
     <w:p>
@@ -104,7 +424,79 @@
         <w:pStyle w:val="ListBullet"/>
       </w:pPr>
       <w:r>
-        <w:t>11 Deployment and CI</w:t>
+        <w:t>`POST /report` — generate a PDF report.</w:t>
+      </w:r>
+    </w:p>
+    <w:p>
+      <w:r>
+        <w:t>Example: Request a forecast (requires that a registry is loaded):</w:t>
+      </w:r>
+    </w:p>
+    <w:p>
+      <w:pPr/>
+      <w:r>
+        <w:rPr>
+          <w:rFonts w:ascii="Courier New" w:hAnsi="Courier New"/>
+          <w:sz w:val="18"/>
+        </w:rPr>
+        <w:t>curl -sS "http://localhost:8000/predict?state=California&amp;horizon=8" | jq</w:t>
+      </w:r>
+    </w:p>
+    <w:p>
+      <w:r>
+        <w:t>Sample response (trimmed):</w:t>
+      </w:r>
+    </w:p>
+    <w:p>
+      <w:pPr/>
+      <w:r>
+        <w:rPr>
+          <w:rFonts w:ascii="Courier New" w:hAnsi="Courier New"/>
+          <w:sz w:val="18"/>
+        </w:rPr>
+        <w:t>{</w:t>
+        <w:br/>
+        <w:t xml:space="preserve">  "state": "California",</w:t>
+        <w:br/>
+        <w:t xml:space="preserve">  "registry_version": "v20260506_175529",</w:t>
+        <w:br/>
+        <w:t xml:space="preserve">  "horizon_weeks": 8,</w:t>
+        <w:br/>
+        <w:t xml:space="preserve">  "selected_models": ["xgboost", "lstm"],</w:t>
+        <w:br/>
+        <w:t xml:space="preserve">  "ensemble_weights": {"xgboost": 0.7, "lstm": 0.3},</w:t>
+        <w:br/>
+        <w:t xml:space="preserve">  "ci_method": "conformal",</w:t>
+        <w:br/>
+        <w:t xml:space="preserve">  "forecast": [</w:t>
+        <w:br/>
+        <w:t xml:space="preserve">    {"date":"2026-05-10","yhat":12345.0,"yhat_lower":11800.0,"yhat_upper":12900.0},</w:t>
+        <w:br/>
+        <w:t xml:space="preserve">    {"date":"2026-05-17","yhat":12450.0,"yhat_lower":11900.0,"yhat_upper":13000.0}</w:t>
+        <w:br/>
+        <w:t xml:space="preserve">  ],</w:t>
+        <w:br/>
+        <w:t xml:space="preserve">  "drift": null</w:t>
+        <w:br/>
+        <w:t>}</w:t>
+      </w:r>
+    </w:p>
+    <w:p>
+      <w:r>
+        <w:t>If no registry is loaded the API will return HTTP 503 with a message: No trained model registry is loaded. Call POST /train first.</w:t>
+      </w:r>
+    </w:p>
+    <w:p>
+      <w:r>
+        <w:t>---</w:t>
+      </w:r>
+    </w:p>
+    <w:p>
+      <w:pPr>
+        <w:pStyle w:val="Heading2"/>
+      </w:pPr>
+      <w:r>
+        <w:t>4. Developer Guide — Key Components</w:t>
       </w:r>
     </w:p>
     <w:p>
@@ -112,7 +504,7 @@
         <w:pStyle w:val="ListBullet"/>
       </w:pPr>
       <w:r>
-        <w:t>12 Testing and Quality</w:t>
+        <w:t>Configuration (`src/sales_forecast/config/settings.py`): Typed config using Pydantic v2. Use `load_config()` to read `config.yaml` and resolve project paths.</w:t>
       </w:r>
     </w:p>
     <w:p>
@@ -120,7 +512,235 @@
         <w:pStyle w:val="ListBullet"/>
       </w:pPr>
       <w:r>
-        <w:t>13 Troubleshooting and Examples</w:t>
+        <w:t>Data loader (`src/sales_forecast/data/loader.py`): Reads Excel/CSV and normalizes columns. Important: date parsing is robust but watch for edge-case formats.</w:t>
+      </w:r>
+    </w:p>
+    <w:p>
+      <w:pPr>
+        <w:pStyle w:val="ListBullet"/>
+      </w:pPr>
+      <w:r>
+        <w:t>Preprocessing (`src/sales_forecast/data/preprocessor.py`): Resamples to weekly grid, imputes gaps, caps/flags outliers.</w:t>
+      </w:r>
+    </w:p>
+    <w:p>
+      <w:pPr>
+        <w:pStyle w:val="ListBullet"/>
+      </w:pPr>
+      <w:r>
+        <w:t>Feature engineering (`src/sales_forecast/features/engineer.py`): Produces lags, rolling stats, calendar, Fourier, and holiday features. The `FeatureEngineer` stores fit-time artifacts used during forecasting.</w:t>
+      </w:r>
+    </w:p>
+    <w:p>
+      <w:pPr>
+        <w:pStyle w:val="ListBullet"/>
+      </w:pPr>
+      <w:r>
+        <w:t>Models (`src/sales_forecast/models`): Implementations of ARIMA, SARIMA, Prophet, XGBoost (Optuna hyperparameter tuning + recursive forecasting), LSTM (PyTorch). Model factory is `models/registry.py`.</w:t>
+      </w:r>
+    </w:p>
+    <w:p>
+      <w:pPr>
+        <w:pStyle w:val="ListBullet"/>
+      </w:pPr>
+      <w:r>
+        <w:t>Training pipeline (`src/sales_forecast/training/pipeline.py`): Walk-forward CV, per-fold OOF predictions, ranking by RMSE, ensembling (inverse_rmse/stacking), final refit, saving artifacts + conformal calibrators.</w:t>
+      </w:r>
+    </w:p>
+    <w:p>
+      <w:pPr>
+        <w:pStyle w:val="ListBullet"/>
+      </w:pPr>
+      <w:r>
+        <w:t>Service layer (`src/sales_forecast/api/service.py`): Loads model artifacts, applies `FeatureEngineer`, performs per-member forecasts, builds ensemble via `WeightedEnsemble`, sanitizes numeric issues, and exposes high-level calls for the API.</w:t>
+      </w:r>
+    </w:p>
+    <w:p>
+      <w:pPr>
+        <w:pStyle w:val="ListBullet"/>
+      </w:pPr>
+      <w:r>
+        <w:t>Registry (`src/sales_forecast/utils/versioning.py`): Filesystem registry with `manifest.json` tracking `current` version and per-version `states/&lt;state&gt;/` artifacts.</w:t>
+      </w:r>
+    </w:p>
+    <w:p>
+      <w:r>
+        <w:t>---</w:t>
+      </w:r>
+    </w:p>
+    <w:p>
+      <w:pPr>
+        <w:pStyle w:val="Heading2"/>
+      </w:pPr>
+      <w:r>
+        <w:t>5. Running Tests &amp; Static Checks</w:t>
+      </w:r>
+    </w:p>
+    <w:p>
+      <w:r>
+        <w:t>Run unit tests:</w:t>
+      </w:r>
+    </w:p>
+    <w:p>
+      <w:pPr/>
+      <w:r>
+        <w:rPr>
+          <w:rFonts w:ascii="Courier New" w:hAnsi="Courier New"/>
+          <w:sz w:val="18"/>
+        </w:rPr>
+        <w:t>pytest -q</w:t>
+      </w:r>
+    </w:p>
+    <w:p>
+      <w:r>
+        <w:t>Run the linter (ruff):</w:t>
+      </w:r>
+    </w:p>
+    <w:p>
+      <w:pPr/>
+      <w:r>
+        <w:rPr>
+          <w:rFonts w:ascii="Courier New" w:hAnsi="Courier New"/>
+          <w:sz w:val="18"/>
+        </w:rPr>
+        <w:t>ruff src tests</w:t>
+      </w:r>
+    </w:p>
+    <w:p>
+      <w:r>
+        <w:t>Run type checks (mypy):</w:t>
+      </w:r>
+    </w:p>
+    <w:p>
+      <w:pPr/>
+      <w:r>
+        <w:rPr>
+          <w:rFonts w:ascii="Courier New" w:hAnsi="Courier New"/>
+          <w:sz w:val="18"/>
+        </w:rPr>
+        <w:t>mypy src --ignore-missing-imports</w:t>
+      </w:r>
+    </w:p>
+    <w:p>
+      <w:r>
+        <w:t>Notes: Tests use tests/conftest.py fixtures which redirect artifact directories to temporary folders.</w:t>
+      </w:r>
+    </w:p>
+    <w:p>
+      <w:r>
+        <w:t>---</w:t>
+      </w:r>
+    </w:p>
+    <w:p>
+      <w:pPr>
+        <w:pStyle w:val="Heading2"/>
+      </w:pPr>
+      <w:r>
+        <w:t>6. Troubleshooting &amp; Known Issues</w:t>
+      </w:r>
+    </w:p>
+    <w:p>
+      <w:pPr>
+        <w:pStyle w:val="ListBullet"/>
+      </w:pPr>
+      <w:r>
+        <w:t>Date parsing: older code used an invalid `isinstance` expression that raises a `TypeError` on some Python versions. The corrected check uses a tuple, e.g. `isinstance(value, (datetime, pd.Timestamp))`. The code location is: [src/sales_forecast/data/loader.py](src/sales_forecast/data/loader.py#L75).</w:t>
+      </w:r>
+    </w:p>
+    <w:p>
+      <w:pPr>
+        <w:pStyle w:val="ListBullet"/>
+      </w:pPr>
+      <w:r>
+        <w:t>Heavy dependencies: packages like `prophet`, `xgboost`, and `torch` can be heavy to install and may require system libraries. For CI or quick tests, consider mocking or pinning lighter alternatives.</w:t>
+      </w:r>
+    </w:p>
+    <w:p>
+      <w:pPr>
+        <w:pStyle w:val="ListBullet"/>
+      </w:pPr>
+      <w:r>
+        <w:t>Broad exception handling: training and API layers sometimes catch broad `Exception`, which can hide underlying errors. When debugging, inspect logs (`project.log_dir`) for full tracebacks.</w:t>
+      </w:r>
+    </w:p>
+    <w:p>
+      <w:r>
+        <w:t>---</w:t>
+      </w:r>
+    </w:p>
+    <w:p>
+      <w:pPr>
+        <w:pStyle w:val="Heading2"/>
+      </w:pPr>
+      <w:r>
+        <w:t>7. Recommended Next Steps</w:t>
+      </w:r>
+    </w:p>
+    <w:p>
+      <w:r>
+        <w:t>1. Run pytest and ruff and fix any test/lint failures.</w:t>
+      </w:r>
+    </w:p>
+    <w:p>
+      <w:r>
+        <w:t>2. Add CI (GitHub Actions): install minimal deps for unit tests (skip heavy ML deps) and run smoke tests.</w:t>
+      </w:r>
+    </w:p>
+    <w:p>
+      <w:r>
+        <w:t>3. Improve observability: surface training logs into a central train.log and add API request tracing.</w:t>
+      </w:r>
+    </w:p>
+    <w:p>
+      <w:r>
+        <w:t>4. Tighten exception handling in api/app.py and training/pipeline.py to avoid masking root causes.</w:t>
+      </w:r>
+    </w:p>
+    <w:p>
+      <w:r>
+        <w:t>---</w:t>
+      </w:r>
+    </w:p>
+    <w:p>
+      <w:pPr>
+        <w:pStyle w:val="Heading2"/>
+      </w:pPr>
+      <w:r>
+        <w:t>8. Contact / Further Help</w:t>
+      </w:r>
+    </w:p>
+    <w:p>
+      <w:r>
+        <w:t>If you want, I can:</w:t>
+      </w:r>
+    </w:p>
+    <w:p>
+      <w:pPr>
+        <w:pStyle w:val="ListBullet"/>
+      </w:pPr>
+      <w:r>
+        <w:t>Run `pytest` in this workspace and report failures.</w:t>
+      </w:r>
+    </w:p>
+    <w:p>
+      <w:pPr>
+        <w:pStyle w:val="ListBullet"/>
+      </w:pPr>
+      <w:r>
+        <w:t>Create a GitHub Actions CI workflow that runs lint/tests (fast profile without heavy ML deps).</w:t>
+      </w:r>
+    </w:p>
+    <w:p>
+      <w:pPr>
+        <w:pStyle w:val="ListBullet"/>
+      </w:pPr>
+      <w:r>
+        <w:t>Patch the `isinstance` bug automatically and run tests.</w:t>
+      </w:r>
+    </w:p>
+    <w:p>
+      <w:r>
+        <w:t>Tell me which of the above you'd like me to do next.</w:t>
       </w:r>
     </w:p>
     <w:p>

</xml_diff>